<commit_message>
Add container recipe + docs, refresh manuscript and 500-dpi figures
Makes the public repository fully functional and documented (reviewer
requirement: functional repository with README + documentation):

- Add Dockerfile + environment.yml (pinned conda-forge; python 3.11,
  opendrift==1.14.9) for one-command reproduction of the open sigma-to-z
  exporter + OpenDrift demo — these were referenced in the manuscript and
  README but not previously committed.
- README already documents the container, CDS/ERA5 setup, Delft3D version,
  the clean-checkout fixture test and manuscript rebuild.
- Regenerate figures at 500 dpi.
- Refresh CAGEO manuscript (C&G template, plain-English compression,
  author/ORCID/keyword/reference updates) and ESI package.

No release cut; Zenodo concept DOI 10.5281/zenodo.20627160 unchanged.

Co-Authored-By: Claude Opus 4.8 <noreply@anthropic.com>
</commit_message>
<xml_diff>
--- a/paper/Highlights.docx
+++ b/paper/Highlights.docx
@@ -3,6 +3,9 @@
 <w:document xmlns:wpc="http://schemas.microsoft.com/office/word/2010/wordprocessingCanvas" xmlns:mo="http://schemas.microsoft.com/office/mac/office/2008/main" xmlns:mc="http://schemas.openxmlformats.org/markup-compatibility/2006" xmlns:mv="urn:schemas-microsoft-com:mac:vml" xmlns:o="urn:schemas-microsoft-com:office:office" xmlns:r="http://schemas.openxmlformats.org/officeDocument/2006/relationships" xmlns:m="http://schemas.openxmlformats.org/officeDocument/2006/math" xmlns:v="urn:schemas-microsoft-com:vml" xmlns:wp14="http://schemas.microsoft.com/office/word/2010/wordprocessingDrawing" xmlns:wp="http://schemas.openxmlformats.org/drawingml/2006/wordprocessingDrawing" xmlns:w10="urn:schemas-microsoft-com:office:word" xmlns:w="http://schemas.openxmlformats.org/wordprocessingml/2006/main" xmlns:w14="http://schemas.microsoft.com/office/word/2010/wordml" xmlns:wpg="http://schemas.microsoft.com/office/word/2010/wordprocessingGroup" xmlns:wpi="http://schemas.microsoft.com/office/word/2010/wordprocessingInk" xmlns:wne="http://schemas.microsoft.com/office/word/2006/wordml" xmlns:wps="http://schemas.microsoft.com/office/word/2010/wordprocessingShape" mc:Ignorable="w14 wp14">
   <w:body>
     <w:p>
+      <w:pPr>
+        <w:spacing w:after="120"/>
+      </w:pPr>
       <w:r>
         <w:rPr>
           <w:b/>
@@ -12,18 +15,17 @@
       </w:r>
     </w:p>
     <w:p>
+      <w:pPr>
+        <w:spacing w:after="160"/>
+      </w:pPr>
       <w:r>
-        <w:rPr>
-          <w:i/>
-          <w:sz w:val="21"/>
-        </w:rPr>
         <w:t>LakeForcing: a σ-to-z coupling algorithm and open pipeline for hydrodynamic and wind-wave forcing of inland lakes to drive Lagrangian transport models</w:t>
       </w:r>
     </w:p>
-    <w:p/>
     <w:p>
       <w:pPr>
         <w:pStyle w:val="ListBullet"/>
+        <w:spacing w:after="60"/>
       </w:pPr>
       <w:r>
         <w:t>Open pipeline turns global open data into transport forcing for any inland lake</w:t>
@@ -32,6 +34,7 @@
     <w:p>
       <w:pPr>
         <w:pStyle w:val="ListBullet"/>
+        <w:spacing w:after="60"/>
       </w:pPr>
       <w:r>
         <w:t>Reusable sigma-layer to z-level coupling links Delft3D-FLOW/WAVE to OpenDrift</w:t>
@@ -40,14 +43,16 @@
     <w:p>
       <w:pPr>
         <w:pStyle w:val="ListBullet"/>
+        <w:spacing w:after="60"/>
       </w:pPr>
       <w:r>
-        <w:t>Closed-lake Delft3D setup auto-built from HydroLAKES/GLOBathy/DAHITI and ERA5</w:t>
+        <w:t>Auto-builds a closed-lake Delft3D model from HydroLAKES/GLOBathy/DAHITI and ERA5</w:t>
       </w:r>
     </w:p>
     <w:p>
       <w:pPr>
         <w:pStyle w:val="ListBullet"/>
+        <w:spacing w:after="60"/>
       </w:pPr>
       <w:r>
         <w:t>Exports CF NetCDF with 3-D currents, waves and surface Stokes drift</w:t>
@@ -56,9 +61,10 @@
     <w:p>
       <w:pPr>
         <w:pStyle w:val="ListBullet"/>
+        <w:spacing w:after="60"/>
       </w:pPr>
       <w:r>
-        <w:t>Demonstrated unchanged on twelve lakes across all inhabited continents</w:t>
+        <w:t>Runs unchanged on twelve lakes worldwide; open, pinned and CI-tested release</w:t>
       </w:r>
     </w:p>
     <w:sectPr>

</xml_diff>